<commit_message>
Add A2 Jersey soft ice cream (Anseong Farmland) to MK article
Co-Authored-By: Claude Opus 5.5 <noreply@anthropic.com>
Claude-Session: https://claude.ai/code/session_01AAhJSJRNm1CGsFjp5LTajX
</commit_message>
<xml_diff>
--- a/deliverables/송영신목장_A2저지헤이밀크_매일경제_원고.docx
+++ b/deliverables/송영신목장_A2저지헤이밀크_매일경제_원고.docx
@@ -172,6 +172,20 @@
           <w:szCs w:val="22"/>
         </w:rPr>
         <w:t xml:space="preserve">그는 올 하반기부터 본격적으로 저지우유를 판매하기 시작하면서 'A2 저지 헤이밀크'라는 이름을 붙였다. 그가 수의사이자 농장주로서 오랫동안 준비해온 프리미엄급 우유에 대한 자신감이 그대로 반영된 이름이다. 생산량이 하루 500ℓ 정도로 한정되기 때문에 일반 판매 보다는 구독판매를 먼저 시작했다. 좋은 우유를 원했던 소비자들이 빠르게 구독을 늘리고 있다. "이런 우유 맛은 난생 처음"이라는 평가 덕분이다. 맛이 깔끔하면서도 뒤에 깊은 풍미가 따라온다는 것이다. 하 원장은 그 비결로 원료의 신선함을 꼽는다. 그는 "아침에 짠 우유를 목장 안 유가공 시설에서 그날 바로, 구독 주문량에 맞춰 소량씩 생산한다"며 "좋은 우유의 마지막 조건은 신선함"이라고 말했다. 해외에서는 이처럼 목장에서 짠 우유를 목장에서 직접 가공하는 방식을 '팜스테드 크리머리(Farmstead Creamery)'라고 부른다. 조용히 입소문이 나면서 명품관을 운영하는 백화점들도 관심을 갖기 시작했다. 압구정 갤러리아 명품관에서 이 우유를 매대에 올려놓기 시작했고, 다른 백화점들과도 입점을 협의하고 있다.</w:t>
+      </w:r>
+    </w:p>
+    <w:p>
+      <w:pPr>
+        <w:spacing w:after="200" w:line="360"/>
+        <w:jc w:val="both"/>
+      </w:pPr>
+      <w:r>
+        <w:rPr>
+          <w:rFonts w:ascii="Malgun Gothic" w:cs="Malgun Gothic" w:eastAsia="Malgun Gothic" w:hAnsi="Malgun Gothic"/>
+          <w:sz w:val="22"/>
+          <w:szCs w:val="22"/>
+        </w:rPr>
+        <w:t xml:space="preserve">우유만이 아니다. 경기 안성팜랜드에 가면 이 A2 저지우유로 만든 소프트아이스크림도 맛볼 수 있다. 목장에서 직접 분리한 유크림을 21% 넣어 만든 것으로, 굳이 일본 홋카이도까지 가지 않아도 진한 목장 아이스크림을 맛볼 수 있다는 게 하 원장의 설명이다. 그는 "100% 저지우유로 만든 소프트아이스크림은 국내에서 이곳이 유일할 것"이라고 말했다.</w:t>
       </w:r>
     </w:p>
     <w:p>

</xml_diff>

<commit_message>
Add sustainability/consumer-choice closing to MK article
Co-Authored-By: Claude Opus 5.5 <noreply@anthropic.com>
Claude-Session: https://claude.ai/code/session_01AAhJSJRNm1CGsFjp5LTajX
</commit_message>
<xml_diff>
--- a/deliverables/송영신목장_A2저지헤이밀크_매일경제_원고.docx
+++ b/deliverables/송영신목장_A2저지헤이밀크_매일경제_원고.docx
@@ -200,6 +200,20 @@
           <w:szCs w:val="22"/>
         </w:rPr>
         <w:t xml:space="preserve">하 원장은 "이 우유를 마셔본 소비자들이 다른 우유와 너무 맛이 다르다고 평가할 때와 그동안에는 속이 불편해서 우유를 피했는데 이 우유는 그렇지 않다고 할 때 보람을 많이 느낀다"며 "우리나라 1호 동물복지, 1호 저탄소 젖소농장이라는 타이틀에 이어 모든 젖소가 A2A2 저지인 농장으로서 자부심을 갖고 앞으로도 좋은 우유 생산에 전념하겠다"고 말했다.</w:t>
+      </w:r>
+    </w:p>
+    <w:p>
+      <w:pPr>
+        <w:spacing w:after="200" w:line="360"/>
+        <w:jc w:val="both"/>
+      </w:pPr>
+      <w:r>
+        <w:rPr>
+          <w:rFonts w:ascii="Malgun Gothic" w:cs="Malgun Gothic" w:eastAsia="Malgun Gothic" w:hAnsi="Malgun Gothic"/>
+          <w:sz w:val="22"/>
+          <w:szCs w:val="22"/>
+        </w:rPr>
+        <w:t xml:space="preserve">그는 이어 "지속가능한 농업을 위해서는 모두가 같은 우유를 만드는 구조에서 벗어나 다양성과 차별성을 갖춰야 한다"며 "소비자에게 더 넓은 선택의 폭을 드리고, 프리미엄 우유로 국산 유제품의 우수성을 보여주고 싶다"고 강조했다. 올해부터 미국·유럽연합(EU)산 우유에 대한 관세가 사라지면서 수입 유제품과의 경쟁이 본격화된 가운데, 송영신목장의 도전이 국내 낙농업에 새로운 해법이 될지 주목된다.</w:t>
       </w:r>
     </w:p>
     <w:p>

</xml_diff>

<commit_message>
Add Made by Soil philosophy to MK article
Co-Authored-By: Claude Opus 5.5 <noreply@anthropic.com>
Claude-Session: https://claude.ai/code/session_01AAhJSJRNm1CGsFjp5LTajX
</commit_message>
<xml_diff>
--- a/deliverables/송영신목장_A2저지헤이밀크_매일경제_원고.docx
+++ b/deliverables/송영신목장_A2저지헤이밀크_매일경제_원고.docx
@@ -73,7 +73,7 @@
           <w:sz w:val="22"/>
           <w:szCs w:val="22"/>
         </w:rPr>
-        <w:t xml:space="preserve">그는 고려동물병원을 운영하는 수의사다. 많은 수의사들이 반려동물 쪽을 선택하고 있지만 그는 우리나라에서는 갈수록 찾기 힘들어지고 있는 대동물 수의사다. 그리고 수정란 이식 전문가다. 수정란 이식은 좋은 암소로부터 여러 개 수정란을 얻은 뒤 이를 평범한 다른 암소의 자궁으로 옮겨 출산하게 함으로써 소 품종을 빠르게 개량하는 방법이다. 최근 들어 각광을 받고 있는 스마트농업의 전문가이기도 하다. 소의 위 속에 집어넣은 센서를 통해 체온과 움직임 등을 실시간 측정해 소의 상태를 파악하는 IT회사도 운영하고 있다. 그는 이러한 모든 역량을 결집해 자신의 젖소농장에 투입하고 있다.</w:t>
+        <w:t xml:space="preserve">그는 고려동물병원을 운영하는 수의사다. 많은 수의사들이 반려동물 쪽을 선택하고 있지만 그는 우리나라에서는 갈수록 찾기 힘들어지고 있는 대동물 수의사다. 그리고 수정란 이식 전문가다. 수정란 이식은 좋은 암소로부터 여러 개 수정란을 얻은 뒤 이를 평범한 다른 암소의 자궁으로 옮겨 출산하게 함으로써 소 품종을 빠르게 개량하는 방법이다. 최근 들어 각광을 받고 있는 스마트농업의 전문가이기도 하다. 소의 위 속에 집어넣은 센서를 통해 체온과 움직임 등을 실시간 측정해 소의 상태를 파악하는 IT회사도 운영하고 있다. 그는 이러한 모든 역량을 결집해 자신의 젖소농장에 투입하고 있다. 그 바탕에 깔린 철학은 "건강한 땅에서 건강한 우유가 나온다"는 것이다. 그는 이를 '메이드 바이 소일(Made by Soil)'이라고 부른다.</w:t>
       </w:r>
     </w:p>
     <w:p>
@@ -115,7 +115,7 @@
           <w:sz w:val="22"/>
           <w:szCs w:val="22"/>
         </w:rPr>
-        <w:t xml:space="preserve">그는 우선 젖소가 자라는 농장 환경 개선에 나섰다. 핵심은 피트모스를 활용한 농장 바닥의 개선이다. 젖소는 하루 30kg의 사료를 먹고 100ℓ의 물을 마시며, 60ℓ가량의 분뇨를 배출한다. 이 때문에 일반 농장에서는 농장 바닥에 톱밥을 뿌리지만 이것만으로는 분뇨 냄새를 피하기 어렵다. 그러나 이 농장에서는 냄새가 거의 나지 않는다. 농장 바닥에 톱밥이 아니라 피트모스를 뿌리기 때문이다. 피트모스는 습지에서 이끼 같은 식물이 수 천년간 쌓이면서 썩지 않고 굳은 유기물로 이탄이라고도 한다. 농장 바닥에 이 피트모스를 뿌리고 트랙터를 이용해 섞어주면 아주 빠른 시간에 분변이 흙으로 바뀐다. 마치 소똥구리가 소똥을 분해해 흙으로 바꾸는 것과 같은 이치다. 톱밥으로 분변을 흙으로 바꾸려면 2년이 걸리지만 피트모스를 활용하면 두 달이면 족하다. 하 원장은 "소는 하루 10시간 이상을 앉아서 쉬어야 하는 가축이다보니 젖을 짜야 하는 젖소의 경우는 농장 바닥의 위생 상태가 매우 중요하다"며 "피트모스를 활용하다보니 바닥이 늘 보송보송하기 때문에 젖소 입장에서도 편안하고, 위생도 챙길 수 있다"고 설명했다.</w:t>
+        <w:t xml:space="preserve">그는 우선 젖소가 자라는 농장 환경 개선에 나섰다. 핵심은 피트모스를 활용한 농장 바닥의 개선이다. 젖소는 하루 30kg의 사료를 먹고 100ℓ의 물을 마시며, 60ℓ가량의 분뇨를 배출한다. 이 때문에 일반 농장에서는 농장 바닥에 톱밥을 뿌리지만 이것만으로는 분뇨 냄새를 피하기 어렵다. 그러나 이 농장에서는 냄새가 거의 나지 않는다. 농장 바닥에 톱밥이 아니라 피트모스를 뿌리기 때문이다. 피트모스는 습지에서 이끼 같은 식물이 수 천년간 쌓이면서 썩지 않고 굳은 유기물로 이탄이라고도 한다. 농장 바닥에 이 피트모스를 뿌리고 트랙터를 이용해 섞어주면 아주 빠른 시간에 분변이 흙으로 바뀐다. 마치 소똥구리가 소똥을 분해해 흙으로 바꾸는 것과 같은 이치다. 톱밥으로 분변을 흙으로 바꾸려면 2년이 걸리지만 피트모스를 활용하면 두 달이면 족하다. 하 원장은 "소는 하루 10시간 이상을 앉아서 쉬어야 하는 가축이다보니 젖을 짜야 하는 젖소의 경우는 농장 바닥의 위생 상태가 매우 중요하다"며 "피트모스를 활용하다보니 바닥이 늘 보송보송하기 때문에 젖소 입장에서도 편안하고, 위생도 챙길 수 있다"고 설명했다. 이렇게 만들어진 퇴비는 다시 초지로 돌아가 소가 먹을 풀을 키운다. 땅에서 시작해 땅으로 돌아가는 '메이드 바이 소일'의 순환이다.</w:t>
       </w:r>
     </w:p>
     <w:p>

</xml_diff>